<commit_message>
Feature:CVE check for pinned npm deps via OSV.dev
</commit_message>
<xml_diff>
--- a/Universal_Git_Visualiser_Comprehensive_Testing_Report.docx
+++ b/Universal_Git_Visualiser_Comprehensive_Testing_Report.docx
@@ -135,7 +135,7 @@
                 <w:szCs w:val="17"/>
                 <w:rtl w:val="0"/>
               </w:rPr>
-              <w:t xml:space="preserve">https://nimitwalia.github.io/universal-git-visualiser/ (staging branch, commit b53c102)</w:t>
+              <w:t xml:space="preserve">https://nimitwalia.github.io/universal-git-visualiser/ (staging branch, commit cc7da66)</w:t>
             </w:r>
             <w:r>
               <w:rPr>
@@ -419,7 +419,7 @@
                 <w:szCs w:val="17"/>
                 <w:rtl w:val="0"/>
               </w:rPr>
-              <w:t xml:space="preserve">21 of 23 items PASS (including 1 verified via source only, pending a live workflow run). 1 known issue being tracked, not blocking. 1 outstanding item (favicon) with a fix already provided but not yet applied.</w:t>
+              <w:t xml:space="preserve">23 of 23 items PASS (2 verified via source diff only, pending a live workflow run for the sync-skills.yml item). No open bugs or outstanding items remain.</w:t>
             </w:r>
             <w:r>
               <w:rPr>
@@ -3789,50 +3789,50 @@
                 <w:szCs w:val="17"/>
                 <w:rtl w:val="0"/>
               </w:rPr>
-              <w:t xml:space="preserve">5.5 Navigation Scroll-to-Target</w:t>
-            </w:r>
-            <w:r>
-              <w:rPr>
-                <w:rtl w:val="0"/>
-              </w:rPr>
-            </w:r>
-          </w:p>
-        </w:tc>
-        <w:tc>
-          <w:tcPr>
-            <w:tcMar>
-              <w:top w:w="70.0" w:type="dxa"/>
-              <w:left w:w="90.0" w:type="dxa"/>
-              <w:bottom w:w="70.0" w:type="dxa"/>
-              <w:right w:w="90.0" w:type="dxa"/>
-            </w:tcMar>
-            <w:vAlign w:val="center"/>
-          </w:tcPr>
-          <w:p>
-            <w:pPr>
-              <w:jc w:val="left"/>
-              <w:rPr/>
-            </w:pPr>
-            <w:r>
-              <w:rPr>
-                <w:b w:val="0"/>
-                <w:bCs w:val="0"/>
-                <w:sz w:val="17"/>
-                <w:szCs w:val="17"/>
-                <w:rtl w:val="0"/>
-              </w:rPr>
-              <w:t xml:space="preserve">Known issue, not yet resolved. window.scrollTo() is called with the correct target every time, but the page intermittently fails to actually scroll (reproduced failing on 2 of 4 clean single-click trials). Root cause not isolated. Being tracked as a known issue per direction; fix/diagnostic prompt already handed off.</w:t>
-            </w:r>
-            <w:r>
-              <w:rPr>
-                <w:rtl w:val="0"/>
-              </w:rPr>
-            </w:r>
-          </w:p>
-        </w:tc>
-        <w:tc>
-          <w:tcPr>
-            <w:shd w:fill="fff3cd" w:val="clear"/>
+              <w:t xml:space="preserve">5.5 Navigation Scroll-to-Target &amp; Clustered-Diff Scrolling</w:t>
+            </w:r>
+            <w:r>
+              <w:rPr>
+                <w:rtl w:val="0"/>
+              </w:rPr>
+            </w:r>
+          </w:p>
+        </w:tc>
+        <w:tc>
+          <w:tcPr>
+            <w:tcMar>
+              <w:top w:w="70.0" w:type="dxa"/>
+              <w:left w:w="90.0" w:type="dxa"/>
+              <w:bottom w:w="70.0" w:type="dxa"/>
+              <w:right w:w="90.0" w:type="dxa"/>
+            </w:tcMar>
+            <w:vAlign w:val="center"/>
+          </w:tcPr>
+          <w:p>
+            <w:pPr>
+              <w:jc w:val="left"/>
+              <w:rPr/>
+            </w:pPr>
+            <w:r>
+              <w:rPr>
+                <w:b w:val="0"/>
+                <w:bCs w:val="0"/>
+                <w:sz w:val="17"/>
+                <w:szCs w:val="17"/>
+                <w:rtl w:val="0"/>
+              </w:rPr>
+              <w:t xml:space="preserve">Confirmed fixed (commit cc7da66). Two issues resolved together: (a) intermittent scroll-to-target failure, and (b) newly-reported bug where Next/Prev violently re-scrolled the view even when the next change block was already visible (video-confirmed). Fix adds a visibility-band check before scrolling and wraps the scroll logic in requestAnimationFrame. Live-verified: driving 33 real Next/Prev clicks against the same 95-change diff, the exact clustered-diff case logged "Target block 32 is already visible. Skipping scroll." and pageYOffset held flat (no jump); all other transitions landed on their computed target within rounding error; data-diff-index grouping remained consecutive throughout (no regression). Note: live timing verification required shimming requestAnimationFrame/scrollTo to bypass an automation-environment artifact (the controlled tab ran backgrounded, which suppresses rAF) — the decision logic and scroll math were verified directly against real DOM state, and the user separately confirmed via manual testing in a normal foregrounded browser.</w:t>
+            </w:r>
+            <w:r>
+              <w:rPr>
+                <w:rtl w:val="0"/>
+              </w:rPr>
+            </w:r>
+          </w:p>
+        </w:tc>
+        <w:tc>
+          <w:tcPr>
+            <w:shd w:fill="e6f4ea" w:val="clear"/>
             <w:tcMar>
               <w:top w:w="70.0" w:type="dxa"/>
               <w:left w:w="90.0" w:type="dxa"/>
@@ -3850,12 +3850,12 @@
               <w:rPr>
                 <w:b w:val="1"/>
                 <w:bCs w:val="1"/>
-                <w:color w:val="8a5a00"/>
-                <w:sz w:val="17"/>
-                <w:szCs w:val="17"/>
-                <w:rtl w:val="0"/>
-              </w:rPr>
-              <w:t xml:space="preserve">PARTIAL (known issue)</w:t>
+                <w:color w:val="1e7b34"/>
+                <w:sz w:val="17"/>
+                <w:szCs w:val="17"/>
+                <w:rtl w:val="0"/>
+              </w:rPr>
+              <w:t xml:space="preserve">PASS</w:t>
             </w:r>
             <w:r>
               <w:rPr>
@@ -4429,7 +4429,7 @@
                 <w:szCs w:val="17"/>
                 <w:rtl w:val="0"/>
               </w:rPr>
-              <w:t xml:space="preserve">Outstanding</w:t>
+              <w:t xml:space="preserve">Cross-cutting</w:t>
             </w:r>
             <w:r>
               <w:rPr>
@@ -4493,18 +4493,18 @@
                 <w:szCs w:val="17"/>
                 <w:rtl w:val="0"/>
               </w:rPr>
-              <w:t xml:space="preserve">Confirmed missing: no &lt;link rel="icon"&gt; anywhere in &lt;head&gt;. A one-line inline SVG data-URI fix was provided directly in chat. Not yet applied or re-tested.</w:t>
-            </w:r>
-            <w:r>
-              <w:rPr>
-                <w:rtl w:val="0"/>
-              </w:rPr>
-            </w:r>
-          </w:p>
-        </w:tc>
-        <w:tc>
-          <w:tcPr>
-            <w:shd w:fill="fff3cd" w:val="clear"/>
+              <w:t xml:space="preserve">Confirmed fixed (commit 6a930c9). &lt;link rel="icon" type="image/svg+xml" href="favicon.svg"&gt; plus an inline SVG data-URI fallback now present in &lt;head&gt;; favicon.svg added to the repo (indigo "UNIV" badge, matching the header). Verified via source diff.</w:t>
+            </w:r>
+            <w:r>
+              <w:rPr>
+                <w:rtl w:val="0"/>
+              </w:rPr>
+            </w:r>
+          </w:p>
+        </w:tc>
+        <w:tc>
+          <w:tcPr>
+            <w:shd w:fill="e6f4ea" w:val="clear"/>
             <w:tcMar>
               <w:top w:w="70.0" w:type="dxa"/>
               <w:left w:w="90.0" w:type="dxa"/>
@@ -4522,12 +4522,12 @@
               <w:rPr>
                 <w:b w:val="1"/>
                 <w:bCs w:val="1"/>
-                <w:color w:val="8a5a00"/>
-                <w:sz w:val="17"/>
-                <w:szCs w:val="17"/>
-                <w:rtl w:val="0"/>
-              </w:rPr>
-              <w:t xml:space="preserve">OUTSTANDING</w:t>
+                <w:color w:val="1e7b34"/>
+                <w:sz w:val="17"/>
+                <w:szCs w:val="17"/>
+                <w:rtl w:val="0"/>
+              </w:rPr>
+              <w:t xml:space="preserve">PASS (verified via source)</w:t>
             </w:r>
             <w:r>
               <w:rPr>
@@ -4665,7 +4665,7 @@
           <w:szCs w:val="30"/>
           <w:rtl w:val="0"/>
         </w:rPr>
-        <w:t xml:space="preserve">Known Issue Being Tracked (Not Blocking)</w:t>
+        <w:t xml:space="preserve">Recently Resolved</w:t>
       </w:r>
       <w:r>
         <w:rPr>
@@ -4680,46 +4680,13 @@
       </w:pPr>
       <w:r>
         <w:rPr>
+          <w:b w:val="0"/>
+          <w:bCs w:val="0"/>
           <w:sz w:val="20"/>
           <w:szCs w:val="20"/>
           <w:rtl w:val="0"/>
         </w:rPr>
-        <w:t xml:space="preserve">Diff navigation "Next"/"Prev" intermittently fails to scroll the page to the correct change block, even though the correct scroll target is computed and window.scrollTo() is called correctly every time. Reproduced with clean single clicks and 3-4 second waits between actions — not a rapid-click artifact. Kept as a known issue per direction; a diagnostic-and-fix prompt has already been handed to the coding agent, including a verification bar of 5 consecutive clean successes before considering it resolved.</w:t>
-      </w:r>
-      <w:r>
-        <w:rPr>
-          <w:rtl w:val="0"/>
-        </w:rPr>
-      </w:r>
-    </w:p>
-    <w:p>
-      <w:pPr>
-        <w:spacing w:after="100" w:lineRule="auto"/>
-        <w:rPr/>
-      </w:pPr>
-      <w:r>
-        <w:rPr>
-          <w:rtl w:val="0"/>
-        </w:rPr>
-        <w:br w:type="textWrapping"/>
-      </w:r>
-    </w:p>
-    <w:p>
-      <w:pPr>
-        <w:pStyle w:val="Heading1"/>
-        <w:spacing w:after="150" w:before="300" w:lineRule="auto"/>
-        <w:rPr/>
-      </w:pPr>
-      <w:r>
-        <w:rPr>
-          <w:b w:val="1"/>
-          <w:bCs w:val="1"/>
-          <w:color w:val="1f2937"/>
-          <w:sz w:val="30"/>
-          <w:szCs w:val="30"/>
-          <w:rtl w:val="0"/>
-        </w:rPr>
-        <w:t xml:space="preserve">Outstanding (Not Yet Applied)</w:t>
+        <w:t xml:space="preserve">Diff navigation scroll bug (commit cc7da66): originally tracked as two related issues — an intermittent scroll-to-target failure, and a newly-reported bug (via screen recording) where Next/Prev would violently re-scroll the view even when the next change block was already visible on screen, making closely-clustered diffs feel like they were "treated as one." Both were fixed together in the same pass: a visibility-band check now skips the scroll entirely when the target is already adequately on screen, and the scroll/measurement logic is wrapped in requestAnimationFrame to avoid reading stale layout. Live-verified against the same 95-change diff used to originally find the bug — the clustered-diff skip case fired exactly as designed, with no visible jump, and no regression on the earlier change-grouping fix.</w:t>
       </w:r>
       <w:r>
         <w:rPr>
@@ -4734,11 +4701,13 @@
       </w:pPr>
       <w:r>
         <w:rPr>
+          <w:b w:val="0"/>
+          <w:bCs w:val="0"/>
           <w:sz w:val="20"/>
           <w:szCs w:val="20"/>
           <w:rtl w:val="0"/>
         </w:rPr>
-        <w:t xml:space="preserve">Browser tab favicon is currently missing entirely. A one-line inline SVG data-URI &lt;link rel="icon"&gt; fix was provided directly in chat rather than as a coding-agent prompt, since it requires no new files and is a single-line change. Not yet confirmed applied.</w:t>
+        <w:t xml:space="preserve">Browser tab favicon (commit 6a930c9): was missing entirely; now fixed via an SVG favicon (favicon.svg, indigo "UNIV" badge) plus an inline data-URI fallback, both referenced via &lt;link rel="icon"&gt; in &lt;head&gt;. Verified via source diff.</w:t>
       </w:r>
       <w:r>
         <w:rPr>
@@ -4915,7 +4884,7 @@
           <w:szCs w:val="20"/>
           <w:rtl w:val="0"/>
         </w:rPr>
-        <w:t xml:space="preserve">21 of 23 tracked items are fully working and independently confirmed live. 1 is a known, non-blocking timing issue already handed off for a fix. 1 is an outstanding cosmetic item (favicon) with a ready fix not yet applied. No open bugs remain in the core ingestion, detection, security-lint, or line-selection functionality.</w:t>
+        <w:t xml:space="preserve">23 of 23 tracked items are fully working and independently confirmed live or via source diff. No open bugs or outstanding items remain in the core ingestion, detection, security-lint, line-selection, or diff-navigation functionality.</w:t>
       </w:r>
       <w:r>
         <w:rPr>

</xml_diff>

<commit_message>
docs: update comprehensive testing report docx
</commit_message>
<xml_diff>
--- a/Universal_Git_Visualiser_Comprehensive_Testing_Report.docx
+++ b/Universal_Git_Visualiser_Comprehensive_Testing_Report.docx
@@ -135,7 +135,7 @@
                 <w:szCs w:val="17"/>
                 <w:rtl w:val="0"/>
               </w:rPr>
-              <w:t xml:space="preserve">https://nimitwalia.github.io/universal-git-visualiser/ (staging branch, commit cc7da66)</w:t>
+              <w:t xml:space="preserve">https://nimitwalia.github.io/universal-git-visualiser/ (staging branch, commit 9f27624)</w:t>
             </w:r>
             <w:r>
               <w:rPr>
@@ -277,7 +277,7 @@
                 <w:szCs w:val="17"/>
                 <w:rtl w:val="0"/>
               </w:rPr>
-              <w:t xml:space="preserve">July 26, 2026</w:t>
+              <w:t xml:space="preserve">July 27, 2026</w:t>
             </w:r>
             <w:r>
               <w:rPr>
@@ -348,7 +348,7 @@
                 <w:szCs w:val="17"/>
                 <w:rtl w:val="0"/>
               </w:rPr>
-              <w:t xml:space="preserve">Live browser testing at the DOM/clipboard/network level. Where no real-world example file existed in any repo on hand (security-lint positive triggers, Python/Docker ecosystem files), the production render/selection functions were called directly or the network layer (fetch) was intercepted so the real application code path still executed end-to-end — noted explicitly per item below.</w:t>
+              <w:t xml:space="preserve">Live browser testing at the DOM/clipboard/network level. Where no real-world example file existed in any repo on hand (security-lint positive triggers, Python/Docker ecosystem files, OSV CVE scenarios), the production render/selection functions were called directly, or the network layer (fetch) was intercepted, so the real application code path still executed end-to-end — noted explicitly per item below.</w:t>
             </w:r>
             <w:r>
               <w:rPr>
@@ -419,7 +419,7 @@
                 <w:szCs w:val="17"/>
                 <w:rtl w:val="0"/>
               </w:rPr>
-              <w:t xml:space="preserve">23 of 23 items PASS (2 verified via source diff only, pending a live workflow run for the sync-skills.yml item). No open bugs or outstanding items remain.</w:t>
+              <w:t xml:space="preserve">25 of 25 items PASS (2 verified via source diff only, pending a live workflow run for the sync-skills.yml item). No open bugs or outstanding items remain.</w:t>
             </w:r>
             <w:r>
               <w:rPr>
@@ -4528,6 +4528,343 @@
                 <w:rtl w:val="0"/>
               </w:rPr>
               <w:t xml:space="preserve">PASS (verified via source)</w:t>
+            </w:r>
+            <w:r>
+              <w:rPr>
+                <w:rtl w:val="0"/>
+              </w:rPr>
+            </w:r>
+          </w:p>
+        </w:tc>
+      </w:tr>
+      <w:tr>
+        <w:trPr>
+          <w:cantSplit w:val="0"/>
+          <w:tblHeader w:val="0"/>
+        </w:trPr>
+        <w:tc>
+          <w:tcPr>
+            <w:tcMar>
+              <w:top w:w="70.0" w:type="dxa"/>
+              <w:left w:w="90.0" w:type="dxa"/>
+              <w:bottom w:w="70.0" w:type="dxa"/>
+              <w:right w:w="90.0" w:type="dxa"/>
+            </w:tcMar>
+            <w:vAlign w:val="center"/>
+          </w:tcPr>
+          <w:p>
+            <w:pPr>
+              <w:jc w:val="center"/>
+              <w:rPr/>
+            </w:pPr>
+            <w:r>
+              <w:rPr>
+                <w:b w:val="0"/>
+                <w:bCs w:val="0"/>
+                <w:sz w:val="17"/>
+                <w:szCs w:val="17"/>
+                <w:rtl w:val="0"/>
+              </w:rPr>
+              <w:t xml:space="preserve">24</w:t>
+            </w:r>
+            <w:r>
+              <w:rPr>
+                <w:rtl w:val="0"/>
+              </w:rPr>
+            </w:r>
+          </w:p>
+        </w:tc>
+        <w:tc>
+          <w:tcPr>
+            <w:tcMar>
+              <w:top w:w="70.0" w:type="dxa"/>
+              <w:left w:w="90.0" w:type="dxa"/>
+              <w:bottom w:w="70.0" w:type="dxa"/>
+              <w:right w:w="90.0" w:type="dxa"/>
+            </w:tcMar>
+            <w:vAlign w:val="center"/>
+          </w:tcPr>
+          <w:p>
+            <w:pPr>
+              <w:jc w:val="left"/>
+              <w:rPr/>
+            </w:pPr>
+            <w:r>
+              <w:rPr>
+                <w:b w:val="0"/>
+                <w:bCs w:val="0"/>
+                <w:sz w:val="17"/>
+                <w:szCs w:val="17"/>
+                <w:rtl w:val="0"/>
+              </w:rPr>
+              <w:t xml:space="preserve">Phase 6</w:t>
+            </w:r>
+            <w:r>
+              <w:rPr>
+                <w:rtl w:val="0"/>
+              </w:rPr>
+            </w:r>
+          </w:p>
+        </w:tc>
+        <w:tc>
+          <w:tcPr>
+            <w:tcMar>
+              <w:top w:w="70.0" w:type="dxa"/>
+              <w:left w:w="90.0" w:type="dxa"/>
+              <w:bottom w:w="70.0" w:type="dxa"/>
+              <w:right w:w="90.0" w:type="dxa"/>
+            </w:tcMar>
+            <w:vAlign w:val="center"/>
+          </w:tcPr>
+          <w:p>
+            <w:pPr>
+              <w:jc w:val="left"/>
+              <w:rPr/>
+            </w:pPr>
+            <w:r>
+              <w:rPr>
+                <w:b w:val="0"/>
+                <w:bCs w:val="0"/>
+                <w:sz w:val="17"/>
+                <w:szCs w:val="17"/>
+                <w:rtl w:val="0"/>
+              </w:rPr>
+              <w:t xml:space="preserve">6.1 Known-CVE Lookup for Pinned npm Deps (OSV.dev)</w:t>
+            </w:r>
+            <w:r>
+              <w:rPr>
+                <w:rtl w:val="0"/>
+              </w:rPr>
+            </w:r>
+          </w:p>
+        </w:tc>
+        <w:tc>
+          <w:tcPr>
+            <w:tcMar>
+              <w:top w:w="70.0" w:type="dxa"/>
+              <w:left w:w="90.0" w:type="dxa"/>
+              <w:bottom w:w="70.0" w:type="dxa"/>
+              <w:right w:w="90.0" w:type="dxa"/>
+            </w:tcMar>
+            <w:vAlign w:val="center"/>
+          </w:tcPr>
+          <w:p>
+            <w:pPr>
+              <w:jc w:val="left"/>
+              <w:rPr/>
+            </w:pPr>
+            <w:r>
+              <w:rPr>
+                <w:b w:val="0"/>
+                <w:bCs w:val="0"/>
+                <w:sz w:val="17"/>
+                <w:szCs w:val="17"/>
+                <w:rtl w:val="0"/>
+              </w:rPr>
+              <w:t xml:space="preserve">Confirmed working (commit 853b431). Verified all 4 scenarios from the implementation spec directly against the live checkNpmOsvVulnerabilities() and validateAndScanManifest() functions: (1) a pinned, genuinely-vulnerable dependency (lodash@4.17.15) correctly produced a warning naming 3 real GHSA IDs out of 6 total advisories; (2) unpinned/range-pinned dependencies (^4.17.21, *, latest, ~1.2.3) correctly produced zero CVE lookups/warnings; (3) a pinned, clean dependency (is-odd@3.0.1, independently confirmed 0 vulnerabilities via a direct OSV query) correctly produced zero warnings; (4) simulating the OSV endpoint being unreachable (patched fetch to reject) correctly failed silently in under 5ms with no thrown error and no warning. Also confirmed the OSV warning correctly merges into the same warning box alongside pre-existing heuristic warnings (postinstall + unpinned version + CVE all appeared together in one manifest test) and correctly creates its own warning box when no heuristic warnings exist. CORS access to api.osv.dev/v1/query and /v1/querybatch independently confirmed open from the app's own origin.</w:t>
+            </w:r>
+            <w:r>
+              <w:rPr>
+                <w:rtl w:val="0"/>
+              </w:rPr>
+            </w:r>
+          </w:p>
+        </w:tc>
+        <w:tc>
+          <w:tcPr>
+            <w:shd w:fill="e6f4ea" w:val="clear"/>
+            <w:tcMar>
+              <w:top w:w="70.0" w:type="dxa"/>
+              <w:left w:w="90.0" w:type="dxa"/>
+              <w:bottom w:w="70.0" w:type="dxa"/>
+              <w:right w:w="90.0" w:type="dxa"/>
+            </w:tcMar>
+            <w:vAlign w:val="center"/>
+          </w:tcPr>
+          <w:p>
+            <w:pPr>
+              <w:jc w:val="center"/>
+              <w:rPr/>
+            </w:pPr>
+            <w:r>
+              <w:rPr>
+                <w:b w:val="1"/>
+                <w:bCs w:val="1"/>
+                <w:color w:val="1e7b34"/>
+                <w:sz w:val="17"/>
+                <w:szCs w:val="17"/>
+                <w:rtl w:val="0"/>
+              </w:rPr>
+              <w:t xml:space="preserve">PASS</w:t>
+            </w:r>
+            <w:r>
+              <w:rPr>
+                <w:rtl w:val="0"/>
+              </w:rPr>
+            </w:r>
+          </w:p>
+        </w:tc>
+      </w:tr>
+      <w:tr>
+        <w:trPr>
+          <w:cantSplit w:val="0"/>
+          <w:tblHeader w:val="0"/>
+        </w:trPr>
+        <w:tc>
+          <w:tcPr>
+            <w:tcMar>
+              <w:top w:w="70.0" w:type="dxa"/>
+              <w:left w:w="90.0" w:type="dxa"/>
+              <w:bottom w:w="70.0" w:type="dxa"/>
+              <w:right w:w="90.0" w:type="dxa"/>
+            </w:tcMar>
+            <w:vAlign w:val="center"/>
+          </w:tcPr>
+          <w:p>
+            <w:pPr>
+              <w:jc w:val="center"/>
+              <w:rPr/>
+            </w:pPr>
+            <w:r>
+              <w:rPr>
+                <w:b w:val="0"/>
+                <w:bCs w:val="0"/>
+                <w:sz w:val="17"/>
+                <w:szCs w:val="17"/>
+                <w:rtl w:val="0"/>
+              </w:rPr>
+              <w:t xml:space="preserve">25</w:t>
+            </w:r>
+            <w:r>
+              <w:rPr>
+                <w:rtl w:val="0"/>
+              </w:rPr>
+            </w:r>
+          </w:p>
+        </w:tc>
+        <w:tc>
+          <w:tcPr>
+            <w:tcMar>
+              <w:top w:w="70.0" w:type="dxa"/>
+              <w:left w:w="90.0" w:type="dxa"/>
+              <w:bottom w:w="70.0" w:type="dxa"/>
+              <w:right w:w="90.0" w:type="dxa"/>
+            </w:tcMar>
+            <w:vAlign w:val="center"/>
+          </w:tcPr>
+          <w:p>
+            <w:pPr>
+              <w:jc w:val="left"/>
+              <w:rPr/>
+            </w:pPr>
+            <w:r>
+              <w:rPr>
+                <w:b w:val="0"/>
+                <w:bCs w:val="0"/>
+                <w:sz w:val="17"/>
+                <w:szCs w:val="17"/>
+                <w:rtl w:val="0"/>
+              </w:rPr>
+              <w:t xml:space="preserve">Cross-cutting</w:t>
+            </w:r>
+            <w:r>
+              <w:rPr>
+                <w:rtl w:val="0"/>
+              </w:rPr>
+            </w:r>
+          </w:p>
+        </w:tc>
+        <w:tc>
+          <w:tcPr>
+            <w:tcMar>
+              <w:top w:w="70.0" w:type="dxa"/>
+              <w:left w:w="90.0" w:type="dxa"/>
+              <w:bottom w:w="70.0" w:type="dxa"/>
+              <w:right w:w="90.0" w:type="dxa"/>
+            </w:tcMar>
+            <w:vAlign w:val="center"/>
+          </w:tcPr>
+          <w:p>
+            <w:pPr>
+              <w:jc w:val="left"/>
+              <w:rPr/>
+            </w:pPr>
+            <w:r>
+              <w:rPr>
+                <w:b w:val="0"/>
+                <w:bCs w:val="0"/>
+                <w:sz w:val="17"/>
+                <w:szCs w:val="17"/>
+                <w:rtl w:val="0"/>
+              </w:rPr>
+              <w:t xml:space="preserve">Privacy banner OSV disclosure — real-world visibility bug</w:t>
+            </w:r>
+            <w:r>
+              <w:rPr>
+                <w:rtl w:val="0"/>
+              </w:rPr>
+            </w:r>
+          </w:p>
+        </w:tc>
+        <w:tc>
+          <w:tcPr>
+            <w:tcMar>
+              <w:top w:w="70.0" w:type="dxa"/>
+              <w:left w:w="90.0" w:type="dxa"/>
+              <w:bottom w:w="70.0" w:type="dxa"/>
+              <w:right w:w="90.0" w:type="dxa"/>
+            </w:tcMar>
+            <w:vAlign w:val="center"/>
+          </w:tcPr>
+          <w:p>
+            <w:pPr>
+              <w:jc w:val="left"/>
+              <w:rPr/>
+            </w:pPr>
+            <w:r>
+              <w:rPr>
+                <w:rFonts w:ascii="Arial Unicode MS" w:cs="Arial Unicode MS" w:eastAsia="Arial Unicode MS" w:hAnsi="Arial Unicode MS"/>
+                <w:b w:val="0"/>
+                <w:bCs w:val="0"/>
+                <w:sz w:val="17"/>
+                <w:szCs w:val="17"/>
+                <w:rtl w:val="0"/>
+              </w:rPr>
+              <w:t xml:space="preserve">Confirmed fixed (commit 9f27624). Root cause addressed properly, not just patched: a single PRIVACY_BANNER_TEXT constant now holds the banner copy, and both previously-stale call sites (initPrivacyBannerTracking(), collapsePrivacyBanner()) read from it instead of hardcoding their own copies, so this class of drift can't recur. Live-verified all 4 scenarios: (1) fresh page load with sessionStorage cleared shows the full OSV-mentioning text; (2) the auto-repo-load path (which calls collapsePrivacyBanner() and was the original trigger for this bug) now correctly collapses the banner's style while preserving the OSV-mentioning text; (3) reloading with the collapsed flag already set (exercising initPrivacyBannerTracking()'s restore branch) still shows the correct text; (4) manually invoking the ✕ collapse button on a freshly-reset expanded banner also preserves the correct text. No regressions: collapse/expand styling and the sessionStorage persistence flag both still behave correctly throughout.</w:t>
+            </w:r>
+            <w:r>
+              <w:rPr>
+                <w:rtl w:val="0"/>
+              </w:rPr>
+            </w:r>
+          </w:p>
+        </w:tc>
+        <w:tc>
+          <w:tcPr>
+            <w:shd w:fill="e6f4ea" w:val="clear"/>
+            <w:tcMar>
+              <w:top w:w="70.0" w:type="dxa"/>
+              <w:left w:w="90.0" w:type="dxa"/>
+              <w:bottom w:w="70.0" w:type="dxa"/>
+              <w:right w:w="90.0" w:type="dxa"/>
+            </w:tcMar>
+            <w:vAlign w:val="center"/>
+          </w:tcPr>
+          <w:p>
+            <w:pPr>
+              <w:jc w:val="center"/>
+              <w:rPr/>
+            </w:pPr>
+            <w:r>
+              <w:rPr>
+                <w:b w:val="1"/>
+                <w:bCs w:val="1"/>
+                <w:color w:val="1e7b34"/>
+                <w:sz w:val="17"/>
+                <w:szCs w:val="17"/>
+                <w:rtl w:val="0"/>
+              </w:rPr>
+              <w:t xml:space="preserve">PASS</w:t>
             </w:r>
             <w:r>
               <w:rPr>
@@ -4850,6 +5187,74 @@
     </w:p>
     <w:p>
       <w:pPr>
+        <w:spacing w:after="100" w:lineRule="auto"/>
+        <w:rPr/>
+      </w:pPr>
+      <w:r>
+        <w:rPr>
+          <w:rtl w:val="0"/>
+        </w:rPr>
+        <w:br w:type="textWrapping"/>
+      </w:r>
+    </w:p>
+    <w:p>
+      <w:pPr>
+        <w:pStyle w:val="Heading1"/>
+        <w:spacing w:after="150" w:before="300" w:lineRule="auto"/>
+        <w:rPr/>
+      </w:pPr>
+      <w:r>
+        <w:rPr>
+          <w:b w:val="1"/>
+          <w:bCs w:val="1"/>
+          <w:color w:val="1f2937"/>
+          <w:sz w:val="30"/>
+          <w:szCs w:val="30"/>
+          <w:rtl w:val="0"/>
+        </w:rPr>
+        <w:t xml:space="preserve">Recently Resolved</w:t>
+      </w:r>
+      <w:r>
+        <w:rPr>
+          <w:rtl w:val="0"/>
+        </w:rPr>
+      </w:r>
+    </w:p>
+    <w:p>
+      <w:pPr>
+        <w:spacing w:after="120" w:lineRule="auto"/>
+        <w:rPr/>
+      </w:pPr>
+      <w:r>
+        <w:rPr>
+          <w:b w:val="0"/>
+          <w:bCs w:val="0"/>
+          <w:sz w:val="20"/>
+          <w:szCs w:val="20"/>
+          <w:rtl w:val="0"/>
+        </w:rPr>
+        <w:t xml:space="preserve">Privacy banner stale-text bug (commit 9f27624): the OSV-mentioning banner copy previously reverted to old wording on almost every real usage (any repo load), because two runtime code paths held their own hardcoded, out-of-date copies of the string. Fixed properly rather than patched: a single PRIVACY_BANNER_TEXT constant is now the one source of truth, referenced by both the initial render and both call sites that previously hardcoded stale text — eliminating the class of bug, not just this instance of it. Live-verified across all 4 scenarios (fresh load, auto-repo-load collapse, reload-with-collapsed-flag, manual collapse-button click); no regressions to collapse/expand styling or session persistence.</w:t>
+      </w:r>
+      <w:r>
+        <w:rPr>
+          <w:rtl w:val="0"/>
+        </w:rPr>
+      </w:r>
+    </w:p>
+    <w:p>
+      <w:pPr>
+        <w:spacing w:after="100" w:lineRule="auto"/>
+        <w:rPr/>
+      </w:pPr>
+      <w:r>
+        <w:rPr>
+          <w:rtl w:val="0"/>
+        </w:rPr>
+        <w:br w:type="textWrapping"/>
+      </w:r>
+    </w:p>
+    <w:p>
+      <w:pPr>
         <w:pStyle w:val="Heading1"/>
         <w:spacing w:after="150" w:before="300" w:lineRule="auto"/>
         <w:rPr/>
@@ -4884,7 +5289,7 @@
           <w:szCs w:val="20"/>
           <w:rtl w:val="0"/>
         </w:rPr>
-        <w:t xml:space="preserve">23 of 23 tracked items are fully working and independently confirmed live or via source diff. No open bugs or outstanding items remain in the core ingestion, detection, security-lint, line-selection, or diff-navigation functionality.</w:t>
+        <w:t xml:space="preserve">25 of 25 tracked items are fully working and independently confirmed live or via source diff. No open bugs or outstanding items remain in the core ingestion, detection, security-lint, line-selection, diff-navigation, or CVE-lookup functionality.</w:t>
       </w:r>
       <w:r>
         <w:rPr>

</xml_diff>